<commit_message>
Update docs with human Windows Terminal screenshots
</commit_message>
<xml_diff>
--- a/2520090137_Practical/Practical-01/Practical-01_Report.docx
+++ b/2520090137_Practical/Practical-01/Practical-01_Report.docx
@@ -4,10 +4,33 @@
   <w:body>
     <w:p>
       <w:pPr>
-        <w:pStyle w:val="Title"/>
+        <w:jc w:val="center"/>
       </w:pPr>
       <w:r>
-        <w:t>Operating Systems &amp; System Programming (OSSP)</w:t>
+        <w:rPr>
+          <w:rFonts w:ascii="Calibri" w:hAnsi="Calibri"/>
+          <w:b/>
+          <w:color w:val="003366"/>
+          <w:sz w:val="40"/>
+        </w:rPr>
+        <w:t>Operating Systems and System Programming</w:t>
+      </w:r>
+    </w:p>
+    <w:p>
+      <w:pPr>
+        <w:jc w:val="center"/>
+      </w:pPr>
+      <w:r>
+        <w:rPr>
+          <w:rFonts w:ascii="Calibri" w:hAnsi="Calibri"/>
+          <w:i/>
+          <w:color w:val="646464"/>
+          <w:sz w:val="24"/>
+        </w:rPr>
+        <w:t>Practical Experiment 01 - Process Control &amp; System Calls</w:t>
+        <w:br/>
+        <w:t>Roll No: 2520090137 | Course: OSSP</w:t>
+        <w:br/>
       </w:r>
     </w:p>
     <w:p>
@@ -15,14 +38,11 @@
         <w:pStyle w:val="Heading1"/>
       </w:pPr>
       <w:r>
-        <w:t>Practical Experiment 01: Process Control &amp; Hardware Abstraction</w:t>
-      </w:r>
-    </w:p>
-    <w:p>
-      <w:r>
-        <w:t>Team / Roll No: 2520090137</w:t>
-        <w:br/>
-        <w:t>Course: OSSP (Operating Systems and System Programming)</w:t>
+        <w:rPr>
+          <w:rFonts w:ascii="Calibri" w:hAnsi="Calibri"/>
+          <w:color w:val="003366"/>
+        </w:rPr>
+        <w:t>Experiment 1: Investigating Hardware Resources and OS Services</w:t>
       </w:r>
     </w:p>
     <w:p>
@@ -30,15 +50,11 @@
         <w:pStyle w:val="Heading2"/>
       </w:pPr>
       <w:r>
-        <w:t>Part A: Hardware Resource &amp; OS Abstraction Commands</w:t>
-      </w:r>
-    </w:p>
-    <w:p>
-      <w:pPr>
-        <w:pStyle w:val="Heading3"/>
-      </w:pPr>
-      <w:r>
-        <w:t>1. OS Info (uname -a)</w:t>
+        <w:rPr>
+          <w:rFonts w:ascii="Calibri" w:hAnsi="Calibri"/>
+          <w:color w:val="006699"/>
+        </w:rPr>
+        <w:t>1) Operating System Information</w:t>
       </w:r>
     </w:p>
     <w:p>
@@ -46,19 +62,14 @@
         <w:rPr>
           <w:b/>
         </w:rPr>
-        <w:t>Command: uname -a</w:t>
-      </w:r>
-    </w:p>
-    <w:p>
-      <w:r>
-        <w:t>Command Screenshot:</w:t>
+        <w:t>Command &amp; Output Screenshot:</w:t>
       </w:r>
     </w:p>
     <w:p>
       <w:r>
         <w:drawing>
           <wp:inline xmlns:a="http://schemas.openxmlformats.org/drawingml/2006/main" xmlns:pic="http://schemas.openxmlformats.org/drawingml/2006/picture">
-            <wp:extent cx="5486400" cy="799447"/>
+            <wp:extent cx="5669280" cy="892912"/>
             <wp:docPr id="1" name="Picture 1"/>
             <wp:cNvGraphicFramePr>
               <a:graphicFrameLocks noChangeAspect="1"/>
@@ -67,7 +78,7 @@
               <a:graphicData uri="http://schemas.openxmlformats.org/drawingml/2006/picture">
                 <pic:pic>
                   <pic:nvPicPr>
-                    <pic:cNvPr id="0" name="1._OS_Info_(uname_-a)_cmd.png"/>
+                    <pic:cNvPr id="0" name="win_cmd_1.png"/>
                     <pic:cNvPicPr/>
                   </pic:nvPicPr>
                   <pic:blipFill>
@@ -79,7 +90,7 @@
                   <pic:spPr>
                     <a:xfrm>
                       <a:off x="0" y="0"/>
-                      <a:ext cx="5486400" cy="799447"/>
+                      <a:ext cx="5669280" cy="892912"/>
                     </a:xfrm>
                     <a:prstGeom prst="rect"/>
                   </pic:spPr>
@@ -90,16 +101,32 @@
         </w:drawing>
       </w:r>
     </w:p>
+    <w:p/>
+    <w:p>
+      <w:pPr>
+        <w:pStyle w:val="Heading2"/>
+      </w:pPr>
+      <w:r>
+        <w:rPr>
+          <w:rFonts w:ascii="Calibri" w:hAnsi="Calibri"/>
+          <w:color w:val="006699"/>
+        </w:rPr>
+        <w:t>2) CPU Information</w:t>
+      </w:r>
+    </w:p>
     <w:p>
       <w:r>
-        <w:t>Output &amp; OS Abstraction Details:</w:t>
+        <w:rPr>
+          <w:b/>
+        </w:rPr>
+        <w:t>Command &amp; Output Screenshot:</w:t>
       </w:r>
     </w:p>
     <w:p>
       <w:r>
         <w:drawing>
           <wp:inline xmlns:a="http://schemas.openxmlformats.org/drawingml/2006/main" xmlns:pic="http://schemas.openxmlformats.org/drawingml/2006/picture">
-            <wp:extent cx="5486400" cy="971877"/>
+            <wp:extent cx="5669280" cy="1885036"/>
             <wp:docPr id="2" name="Picture 2"/>
             <wp:cNvGraphicFramePr>
               <a:graphicFrameLocks noChangeAspect="1"/>
@@ -108,7 +135,7 @@
               <a:graphicData uri="http://schemas.openxmlformats.org/drawingml/2006/picture">
                 <pic:pic>
                   <pic:nvPicPr>
-                    <pic:cNvPr id="0" name="1._OS_Info_(uname_-a)_out.png"/>
+                    <pic:cNvPr id="0" name="win_cmd_2.png"/>
                     <pic:cNvPicPr/>
                   </pic:nvPicPr>
                   <pic:blipFill>
@@ -120,7 +147,7 @@
                   <pic:spPr>
                     <a:xfrm>
                       <a:off x="0" y="0"/>
-                      <a:ext cx="5486400" cy="971877"/>
+                      <a:ext cx="5669280" cy="1885036"/>
                     </a:xfrm>
                     <a:prstGeom prst="rect"/>
                   </pic:spPr>
@@ -131,12 +158,17 @@
         </w:drawing>
       </w:r>
     </w:p>
+    <w:p/>
     <w:p>
       <w:pPr>
-        <w:pStyle w:val="Heading3"/>
+        <w:pStyle w:val="Heading2"/>
       </w:pPr>
       <w:r>
-        <w:t>2. CPU Info (lscpu)</w:t>
+        <w:rPr>
+          <w:rFonts w:ascii="Calibri" w:hAnsi="Calibri"/>
+          <w:color w:val="006699"/>
+        </w:rPr>
+        <w:t>3) Storage Information</w:t>
       </w:r>
     </w:p>
     <w:p>
@@ -144,19 +176,14 @@
         <w:rPr>
           <w:b/>
         </w:rPr>
-        <w:t>Command: lscpu</w:t>
-      </w:r>
-    </w:p>
-    <w:p>
-      <w:r>
-        <w:t>Command Screenshot:</w:t>
+        <w:t>Command &amp; Output Screenshot:</w:t>
       </w:r>
     </w:p>
     <w:p>
       <w:r>
         <w:drawing>
           <wp:inline xmlns:a="http://schemas.openxmlformats.org/drawingml/2006/main" xmlns:pic="http://schemas.openxmlformats.org/drawingml/2006/picture">
-            <wp:extent cx="5486400" cy="799447"/>
+            <wp:extent cx="5669280" cy="1176376"/>
             <wp:docPr id="3" name="Picture 3"/>
             <wp:cNvGraphicFramePr>
               <a:graphicFrameLocks noChangeAspect="1"/>
@@ -165,7 +192,7 @@
               <a:graphicData uri="http://schemas.openxmlformats.org/drawingml/2006/picture">
                 <pic:pic>
                   <pic:nvPicPr>
-                    <pic:cNvPr id="0" name="2._CPU_Info_(lscpu)_cmd.png"/>
+                    <pic:cNvPr id="0" name="win_cmd_3.png"/>
                     <pic:cNvPicPr/>
                   </pic:nvPicPr>
                   <pic:blipFill>
@@ -177,7 +204,7 @@
                   <pic:spPr>
                     <a:xfrm>
                       <a:off x="0" y="0"/>
-                      <a:ext cx="5486400" cy="799447"/>
+                      <a:ext cx="5669280" cy="1176376"/>
                     </a:xfrm>
                     <a:prstGeom prst="rect"/>
                   </pic:spPr>
@@ -188,16 +215,32 @@
         </w:drawing>
       </w:r>
     </w:p>
+    <w:p/>
+    <w:p>
+      <w:pPr>
+        <w:pStyle w:val="Heading2"/>
+      </w:pPr>
+      <w:r>
+        <w:rPr>
+          <w:rFonts w:ascii="Calibri" w:hAnsi="Calibri"/>
+          <w:color w:val="006699"/>
+        </w:rPr>
+        <w:t>4) Process Information</w:t>
+      </w:r>
+    </w:p>
     <w:p>
       <w:r>
-        <w:t>Output &amp; OS Abstraction Details:</w:t>
+        <w:rPr>
+          <w:b/>
+        </w:rPr>
+        <w:t>Command &amp; Output Screenshot:</w:t>
       </w:r>
     </w:p>
     <w:p>
       <w:r>
         <w:drawing>
           <wp:inline xmlns:a="http://schemas.openxmlformats.org/drawingml/2006/main" xmlns:pic="http://schemas.openxmlformats.org/drawingml/2006/picture">
-            <wp:extent cx="5486400" cy="1316736"/>
+            <wp:extent cx="5669280" cy="1318108"/>
             <wp:docPr id="4" name="Picture 4"/>
             <wp:cNvGraphicFramePr>
               <a:graphicFrameLocks noChangeAspect="1"/>
@@ -206,7 +249,7 @@
               <a:graphicData uri="http://schemas.openxmlformats.org/drawingml/2006/picture">
                 <pic:pic>
                   <pic:nvPicPr>
-                    <pic:cNvPr id="0" name="2._CPU_Info_(lscpu)_out.png"/>
+                    <pic:cNvPr id="0" name="win_cmd_4.png"/>
                     <pic:cNvPicPr/>
                   </pic:nvPicPr>
                   <pic:blipFill>
@@ -218,7 +261,7 @@
                   <pic:spPr>
                     <a:xfrm>
                       <a:off x="0" y="0"/>
-                      <a:ext cx="5486400" cy="1316736"/>
+                      <a:ext cx="5669280" cy="1318108"/>
                     </a:xfrm>
                     <a:prstGeom prst="rect"/>
                   </pic:spPr>
@@ -229,12 +272,17 @@
         </w:drawing>
       </w:r>
     </w:p>
+    <w:p/>
     <w:p>
       <w:pPr>
-        <w:pStyle w:val="Heading3"/>
+        <w:pStyle w:val="Heading2"/>
       </w:pPr>
       <w:r>
-        <w:t>3. Storage Info (lsblk)</w:t>
+        <w:rPr>
+          <w:rFonts w:ascii="Calibri" w:hAnsi="Calibri"/>
+          <w:color w:val="006699"/>
+        </w:rPr>
+        <w:t>5) System Monitoring</w:t>
       </w:r>
     </w:p>
     <w:p>
@@ -242,19 +290,14 @@
         <w:rPr>
           <w:b/>
         </w:rPr>
-        <w:t>Command: lsblk</w:t>
-      </w:r>
-    </w:p>
-    <w:p>
-      <w:r>
-        <w:t>Command Screenshot:</w:t>
+        <w:t>Command &amp; Output Screenshot:</w:t>
       </w:r>
     </w:p>
     <w:p>
       <w:r>
         <w:drawing>
           <wp:inline xmlns:a="http://schemas.openxmlformats.org/drawingml/2006/main" xmlns:pic="http://schemas.openxmlformats.org/drawingml/2006/picture">
-            <wp:extent cx="5486400" cy="799447"/>
+            <wp:extent cx="5669280" cy="1318108"/>
             <wp:docPr id="5" name="Picture 5"/>
             <wp:cNvGraphicFramePr>
               <a:graphicFrameLocks noChangeAspect="1"/>
@@ -263,7 +306,7 @@
               <a:graphicData uri="http://schemas.openxmlformats.org/drawingml/2006/picture">
                 <pic:pic>
                   <pic:nvPicPr>
-                    <pic:cNvPr id="0" name="3._Storage_Info_(lsblk)_cmd.png"/>
+                    <pic:cNvPr id="0" name="win_cmd_5.png"/>
                     <pic:cNvPicPr/>
                   </pic:nvPicPr>
                   <pic:blipFill>
@@ -275,7 +318,7 @@
                   <pic:spPr>
                     <a:xfrm>
                       <a:off x="0" y="0"/>
-                      <a:ext cx="5486400" cy="799447"/>
+                      <a:ext cx="5669280" cy="1318108"/>
                     </a:xfrm>
                     <a:prstGeom prst="rect"/>
                   </pic:spPr>
@@ -286,16 +329,72 @@
         </w:drawing>
       </w:r>
     </w:p>
+    <w:p/>
+    <w:p>
+      <w:pPr>
+        <w:pStyle w:val="Heading1"/>
+      </w:pPr>
+      <w:r>
+        <w:rPr>
+          <w:rFonts w:ascii="Calibri" w:hAnsi="Calibri"/>
+          <w:color w:val="003366"/>
+        </w:rPr>
+        <w:t>Experiment-Fork() : Command Execution using fork(), exec(), and wait()</w:t>
+      </w:r>
+    </w:p>
+    <w:p>
+      <w:pPr>
+        <w:pStyle w:val="Heading2"/>
+      </w:pPr>
+      <w:r>
+        <w:rPr>
+          <w:rFonts w:ascii="Calibri" w:hAnsi="Calibri"/>
+          <w:color w:val="006699"/>
+        </w:rPr>
+        <w:t>Program 1: One Process (Before fork())</w:t>
+      </w:r>
+    </w:p>
     <w:p>
       <w:r>
-        <w:t>Output &amp; OS Abstraction Details:</w:t>
+        <w:rPr>
+          <w:b/>
+        </w:rPr>
+        <w:t>Source Code:</w:t>
+        <w:br/>
+      </w:r>
+      <w:r>
+        <w:rPr>
+          <w:rFonts w:ascii="Consolas" w:hAnsi="Consolas"/>
+          <w:sz w:val="19"/>
+        </w:rPr>
+        <w:t>#include &lt;stdio.h&gt;</w:t>
+        <w:br/>
+        <w:t>#include &lt;unistd.h&gt;</w:t>
+        <w:br/>
+        <w:t>int main()</w:t>
+        <w:br/>
+        <w:t>{</w:t>
+        <w:br/>
+        <w:t xml:space="preserve">    printf("PID = %d\n", getpid());</w:t>
+        <w:br/>
+        <w:t xml:space="preserve">    return 0;</w:t>
+        <w:br/>
+        <w:t>}</w:t>
+      </w:r>
+    </w:p>
+    <w:p>
+      <w:r>
+        <w:rPr>
+          <w:b/>
+        </w:rPr>
+        <w:t>Output Screenshot:</w:t>
       </w:r>
     </w:p>
     <w:p>
       <w:r>
         <w:drawing>
           <wp:inline xmlns:a="http://schemas.openxmlformats.org/drawingml/2006/main" xmlns:pic="http://schemas.openxmlformats.org/drawingml/2006/picture">
-            <wp:extent cx="5486400" cy="1144306"/>
+            <wp:extent cx="5669280" cy="892912"/>
             <wp:docPr id="6" name="Picture 6"/>
             <wp:cNvGraphicFramePr>
               <a:graphicFrameLocks noChangeAspect="1"/>
@@ -304,7 +403,7 @@
               <a:graphicData uri="http://schemas.openxmlformats.org/drawingml/2006/picture">
                 <pic:pic>
                   <pic:nvPicPr>
-                    <pic:cNvPr id="0" name="3._Storage_Info_(lsblk)_out.png"/>
+                    <pic:cNvPr id="0" name="win_prog_1.png"/>
                     <pic:cNvPicPr/>
                   </pic:nvPicPr>
                   <pic:blipFill>
@@ -316,7 +415,7 @@
                   <pic:spPr>
                     <a:xfrm>
                       <a:off x="0" y="0"/>
-                      <a:ext cx="5486400" cy="1144306"/>
+                      <a:ext cx="5669280" cy="892912"/>
                     </a:xfrm>
                     <a:prstGeom prst="rect"/>
                   </pic:spPr>
@@ -327,12 +426,17 @@
         </w:drawing>
       </w:r>
     </w:p>
+    <w:p/>
     <w:p>
       <w:pPr>
-        <w:pStyle w:val="Heading3"/>
+        <w:pStyle w:val="Heading2"/>
       </w:pPr>
       <w:r>
-        <w:t>4. Process Info (ps -ef)</w:t>
+        <w:rPr>
+          <w:rFonts w:ascii="Calibri" w:hAnsi="Calibri"/>
+          <w:color w:val="006699"/>
+        </w:rPr>
+        <w:t>Program 2: fork() Creates a Child</w:t>
       </w:r>
     </w:p>
     <w:p>
@@ -340,19 +444,44 @@
         <w:rPr>
           <w:b/>
         </w:rPr>
-        <w:t>Command: ps -ef</w:t>
+        <w:t>Source Code:</w:t>
+        <w:br/>
+      </w:r>
+      <w:r>
+        <w:rPr>
+          <w:rFonts w:ascii="Consolas" w:hAnsi="Consolas"/>
+          <w:sz w:val="19"/>
+        </w:rPr>
+        <w:t>#include &lt;stdio.h&gt;</w:t>
+        <w:br/>
+        <w:t>#include &lt;unistd.h&gt;</w:t>
+        <w:br/>
+        <w:t>int main()</w:t>
+        <w:br/>
+        <w:t>{</w:t>
+        <w:br/>
+        <w:t xml:space="preserve">    fork();</w:t>
+        <w:br/>
+        <w:t xml:space="preserve">    printf("Hello\n");</w:t>
+        <w:br/>
+        <w:t xml:space="preserve">    return 0;</w:t>
+        <w:br/>
+        <w:t>}</w:t>
       </w:r>
     </w:p>
     <w:p>
       <w:r>
-        <w:t>Command Screenshot:</w:t>
+        <w:rPr>
+          <w:b/>
+        </w:rPr>
+        <w:t>Output Screenshot:</w:t>
       </w:r>
     </w:p>
     <w:p>
       <w:r>
         <w:drawing>
           <wp:inline xmlns:a="http://schemas.openxmlformats.org/drawingml/2006/main" xmlns:pic="http://schemas.openxmlformats.org/drawingml/2006/picture">
-            <wp:extent cx="5486400" cy="799447"/>
+            <wp:extent cx="5669280" cy="1034644"/>
             <wp:docPr id="7" name="Picture 7"/>
             <wp:cNvGraphicFramePr>
               <a:graphicFrameLocks noChangeAspect="1"/>
@@ -361,7 +490,7 @@
               <a:graphicData uri="http://schemas.openxmlformats.org/drawingml/2006/picture">
                 <pic:pic>
                   <pic:nvPicPr>
-                    <pic:cNvPr id="0" name="4._Process_Info_(ps_-ef)_cmd.png"/>
+                    <pic:cNvPr id="0" name="win_prog_2.png"/>
                     <pic:cNvPicPr/>
                   </pic:nvPicPr>
                   <pic:blipFill>
@@ -373,7 +502,7 @@
                   <pic:spPr>
                     <a:xfrm>
                       <a:off x="0" y="0"/>
-                      <a:ext cx="5486400" cy="799447"/>
+                      <a:ext cx="5669280" cy="1034644"/>
                     </a:xfrm>
                     <a:prstGeom prst="rect"/>
                   </pic:spPr>
@@ -384,16 +513,70 @@
         </w:drawing>
       </w:r>
     </w:p>
+    <w:p/>
+    <w:p>
+      <w:pPr>
+        <w:pStyle w:val="Heading2"/>
+      </w:pPr>
+      <w:r>
+        <w:rPr>
+          <w:rFonts w:ascii="Calibri" w:hAnsi="Calibri"/>
+          <w:color w:val="006699"/>
+        </w:rPr>
+        <w:t>Program 3: Parent vs Child</w:t>
+      </w:r>
+    </w:p>
     <w:p>
       <w:r>
-        <w:t>Output &amp; OS Abstraction Details:</w:t>
+        <w:rPr>
+          <w:b/>
+        </w:rPr>
+        <w:t>Source Code:</w:t>
+        <w:br/>
+      </w:r>
+      <w:r>
+        <w:rPr>
+          <w:rFonts w:ascii="Consolas" w:hAnsi="Consolas"/>
+          <w:sz w:val="19"/>
+        </w:rPr>
+        <w:t>#include &lt;stdio.h&gt;</w:t>
+        <w:br/>
+        <w:t>#include &lt;unistd.h&gt;</w:t>
+        <w:br/>
+        <w:t>int main()</w:t>
+        <w:br/>
+        <w:t>{</w:t>
+        <w:br/>
+        <w:t xml:space="preserve">    pid_t pid;</w:t>
+        <w:br/>
+        <w:t xml:space="preserve">    pid = fork();</w:t>
+        <w:br/>
+        <w:t xml:space="preserve">    if(pid == 0)</w:t>
+        <w:br/>
+        <w:t xml:space="preserve">        printf("I am Child\n");</w:t>
+        <w:br/>
+        <w:t xml:space="preserve">    else</w:t>
+        <w:br/>
+        <w:t xml:space="preserve">        printf("I am Parent\n");</w:t>
+        <w:br/>
+        <w:t xml:space="preserve">    return 0;</w:t>
+        <w:br/>
+        <w:t>}</w:t>
+      </w:r>
+    </w:p>
+    <w:p>
+      <w:r>
+        <w:rPr>
+          <w:b/>
+        </w:rPr>
+        <w:t>Output Screenshot:</w:t>
       </w:r>
     </w:p>
     <w:p>
       <w:r>
         <w:drawing>
           <wp:inline xmlns:a="http://schemas.openxmlformats.org/drawingml/2006/main" xmlns:pic="http://schemas.openxmlformats.org/drawingml/2006/picture">
-            <wp:extent cx="5486400" cy="1316736"/>
+            <wp:extent cx="5669280" cy="1034644"/>
             <wp:docPr id="8" name="Picture 8"/>
             <wp:cNvGraphicFramePr>
               <a:graphicFrameLocks noChangeAspect="1"/>
@@ -402,7 +585,7 @@
               <a:graphicData uri="http://schemas.openxmlformats.org/drawingml/2006/picture">
                 <pic:pic>
                   <pic:nvPicPr>
-                    <pic:cNvPr id="0" name="4._Process_Info_(ps_-ef)_out.png"/>
+                    <pic:cNvPr id="0" name="win_prog_3.png"/>
                     <pic:cNvPicPr/>
                   </pic:nvPicPr>
                   <pic:blipFill>
@@ -414,7 +597,7 @@
                   <pic:spPr>
                     <a:xfrm>
                       <a:off x="0" y="0"/>
-                      <a:ext cx="5486400" cy="1316736"/>
+                      <a:ext cx="5669280" cy="1034644"/>
                     </a:xfrm>
                     <a:prstGeom prst="rect"/>
                   </pic:spPr>
@@ -425,12 +608,17 @@
         </w:drawing>
       </w:r>
     </w:p>
+    <w:p/>
     <w:p>
       <w:pPr>
-        <w:pStyle w:val="Heading3"/>
+        <w:pStyle w:val="Heading2"/>
       </w:pPr>
       <w:r>
-        <w:t>5. System Monitoring (top)</w:t>
+        <w:rPr>
+          <w:rFonts w:ascii="Calibri" w:hAnsi="Calibri"/>
+          <w:color w:val="006699"/>
+        </w:rPr>
+        <w:t>Program 4: Display Both PIDs</w:t>
       </w:r>
     </w:p>
     <w:p>
@@ -438,19 +626,64 @@
         <w:rPr>
           <w:b/>
         </w:rPr>
-        <w:t>Command: top</w:t>
+        <w:t>Source Code:</w:t>
+        <w:br/>
+      </w:r>
+      <w:r>
+        <w:rPr>
+          <w:rFonts w:ascii="Consolas" w:hAnsi="Consolas"/>
+          <w:sz w:val="19"/>
+        </w:rPr>
+        <w:t>#include &lt;stdio.h&gt;</w:t>
+        <w:br/>
+        <w:t>#include &lt;unistd.h&gt;</w:t>
+        <w:br/>
+        <w:t>int main()</w:t>
+        <w:br/>
+        <w:t>{</w:t>
+        <w:br/>
+        <w:t xml:space="preserve">    pid_t pid;</w:t>
+        <w:br/>
+        <w:t xml:space="preserve">    pid = fork();</w:t>
+        <w:br/>
+        <w:t xml:space="preserve">    if(pid == 0)</w:t>
+        <w:br/>
+        <w:t xml:space="preserve">    {</w:t>
+        <w:br/>
+        <w:t xml:space="preserve">        printf("Child PID = %d\n", getpid());</w:t>
+        <w:br/>
+        <w:t xml:space="preserve">        printf("Parent PID = %d\n", getppid());</w:t>
+        <w:br/>
+        <w:t xml:space="preserve">    }</w:t>
+        <w:br/>
+        <w:t xml:space="preserve">    else</w:t>
+        <w:br/>
+        <w:t xml:space="preserve">    {</w:t>
+        <w:br/>
+        <w:t xml:space="preserve">        printf("Parent PID = %d\n", getpid());</w:t>
+        <w:br/>
+        <w:t xml:space="preserve">        printf("Child PID = %d\n", pid);</w:t>
+        <w:br/>
+        <w:t xml:space="preserve">    }</w:t>
+        <w:br/>
+        <w:t xml:space="preserve">    return 0;</w:t>
+        <w:br/>
+        <w:t>}</w:t>
       </w:r>
     </w:p>
     <w:p>
       <w:r>
-        <w:t>Command Screenshot:</w:t>
+        <w:rPr>
+          <w:b/>
+        </w:rPr>
+        <w:t>Output Screenshot:</w:t>
       </w:r>
     </w:p>
     <w:p>
       <w:r>
         <w:drawing>
           <wp:inline xmlns:a="http://schemas.openxmlformats.org/drawingml/2006/main" xmlns:pic="http://schemas.openxmlformats.org/drawingml/2006/picture">
-            <wp:extent cx="5486400" cy="799447"/>
+            <wp:extent cx="5669280" cy="1318108"/>
             <wp:docPr id="9" name="Picture 9"/>
             <wp:cNvGraphicFramePr>
               <a:graphicFrameLocks noChangeAspect="1"/>
@@ -459,7 +692,7 @@
               <a:graphicData uri="http://schemas.openxmlformats.org/drawingml/2006/picture">
                 <pic:pic>
                   <pic:nvPicPr>
-                    <pic:cNvPr id="0" name="5._System_Monitoring_(top)_cmd.png"/>
+                    <pic:cNvPr id="0" name="win_prog_4.png"/>
                     <pic:cNvPicPr/>
                   </pic:nvPicPr>
                   <pic:blipFill>
@@ -471,7 +704,7 @@
                   <pic:spPr>
                     <a:xfrm>
                       <a:off x="0" y="0"/>
-                      <a:ext cx="5486400" cy="799447"/>
+                      <a:ext cx="5669280" cy="1318108"/>
                     </a:xfrm>
                     <a:prstGeom prst="rect"/>
                   </pic:spPr>
@@ -482,16 +715,80 @@
         </w:drawing>
       </w:r>
     </w:p>
+    <w:p/>
+    <w:p>
+      <w:pPr>
+        <w:pStyle w:val="Heading2"/>
+      </w:pPr>
+      <w:r>
+        <w:rPr>
+          <w:rFonts w:ascii="Calibri" w:hAnsi="Calibri"/>
+          <w:color w:val="006699"/>
+        </w:rPr>
+        <w:t>Program 5: Parent Waits for Child</w:t>
+      </w:r>
+    </w:p>
     <w:p>
       <w:r>
-        <w:t>Output &amp; OS Abstraction Details:</w:t>
+        <w:rPr>
+          <w:b/>
+        </w:rPr>
+        <w:t>Source Code:</w:t>
+        <w:br/>
+      </w:r>
+      <w:r>
+        <w:rPr>
+          <w:rFonts w:ascii="Consolas" w:hAnsi="Consolas"/>
+          <w:sz w:val="19"/>
+        </w:rPr>
+        <w:t>#include &lt;stdio.h&gt;</w:t>
+        <w:br/>
+        <w:t>#include &lt;unistd.h&gt;</w:t>
+        <w:br/>
+        <w:t>#include &lt;sys/wait.h&gt;</w:t>
+        <w:br/>
+        <w:t>int main()</w:t>
+        <w:br/>
+        <w:t>{</w:t>
+        <w:br/>
+        <w:t xml:space="preserve">    pid_t pid = fork();</w:t>
+        <w:br/>
+        <w:t xml:space="preserve">    if(pid == 0)</w:t>
+        <w:br/>
+        <w:t xml:space="preserve">    {</w:t>
+        <w:br/>
+        <w:t xml:space="preserve">        printf("Child Executing\n");</w:t>
+        <w:br/>
+        <w:t xml:space="preserve">    }</w:t>
+        <w:br/>
+        <w:t xml:space="preserve">    else</w:t>
+        <w:br/>
+        <w:t xml:space="preserve">    {</w:t>
+        <w:br/>
+        <w:t xml:space="preserve">        wait(NULL);</w:t>
+        <w:br/>
+        <w:t xml:space="preserve">        printf("Parent Executing\n");</w:t>
+        <w:br/>
+        <w:t xml:space="preserve">    }</w:t>
+        <w:br/>
+        <w:t xml:space="preserve">    return 0;</w:t>
+        <w:br/>
+        <w:t>}</w:t>
+      </w:r>
+    </w:p>
+    <w:p>
+      <w:r>
+        <w:rPr>
+          <w:b/>
+        </w:rPr>
+        <w:t>Output Screenshot:</w:t>
       </w:r>
     </w:p>
     <w:p>
       <w:r>
         <w:drawing>
           <wp:inline xmlns:a="http://schemas.openxmlformats.org/drawingml/2006/main" xmlns:pic="http://schemas.openxmlformats.org/drawingml/2006/picture">
-            <wp:extent cx="5486400" cy="971877"/>
+            <wp:extent cx="5669280" cy="1034644"/>
             <wp:docPr id="10" name="Picture 10"/>
             <wp:cNvGraphicFramePr>
               <a:graphicFrameLocks noChangeAspect="1"/>
@@ -500,7 +797,7 @@
               <a:graphicData uri="http://schemas.openxmlformats.org/drawingml/2006/picture">
                 <pic:pic>
                   <pic:nvPicPr>
-                    <pic:cNvPr id="0" name="5._System_Monitoring_(top)_out.png"/>
+                    <pic:cNvPr id="0" name="win_prog_5.png"/>
                     <pic:cNvPicPr/>
                   </pic:nvPicPr>
                   <pic:blipFill>
@@ -512,7 +809,7 @@
                   <pic:spPr>
                     <a:xfrm>
                       <a:off x="0" y="0"/>
-                      <a:ext cx="5486400" cy="971877"/>
+                      <a:ext cx="5669280" cy="1034644"/>
                     </a:xfrm>
                     <a:prstGeom prst="rect"/>
                   </pic:spPr>
@@ -523,37 +820,64 @@
         </w:drawing>
       </w:r>
     </w:p>
+    <w:p/>
     <w:p>
       <w:pPr>
         <w:pStyle w:val="Heading2"/>
       </w:pPr>
       <w:r>
-        <w:t>Part B: Process Control System Calls (fork, exec, wait)</w:t>
-      </w:r>
-    </w:p>
-    <w:p>
-      <w:pPr>
-        <w:pStyle w:val="Heading3"/>
-      </w:pPr>
-      <w:r>
-        <w:t>Program 1: One Process (Before fork())</w:t>
+        <w:rPr>
+          <w:rFonts w:ascii="Calibri" w:hAnsi="Calibri"/>
+          <w:color w:val="006699"/>
+        </w:rPr>
+        <w:t>Program 6: Multiple fork() Calls</w:t>
       </w:r>
     </w:p>
     <w:p>
       <w:r>
-        <w:t>Explanation: Introduces getpid() to inspect process identity.</w:t>
+        <w:rPr>
+          <w:b/>
+        </w:rPr>
+        <w:t>Source Code:</w:t>
+        <w:br/>
+      </w:r>
+      <w:r>
+        <w:rPr>
+          <w:rFonts w:ascii="Consolas" w:hAnsi="Consolas"/>
+          <w:sz w:val="19"/>
+        </w:rPr>
+        <w:t>#include &lt;stdio.h&gt;</w:t>
+        <w:br/>
+        <w:t>#include &lt;unistd.h&gt;</w:t>
+        <w:br/>
+        <w:t>int main()</w:t>
+        <w:br/>
+        <w:t>{</w:t>
+        <w:br/>
+        <w:t xml:space="preserve">    fork();</w:t>
+        <w:br/>
+        <w:t xml:space="preserve">    fork();</w:t>
+        <w:br/>
+        <w:t xml:space="preserve">    printf("PID = %d\n", getpid());</w:t>
+        <w:br/>
+        <w:t xml:space="preserve">    return 0;</w:t>
+        <w:br/>
+        <w:t>}</w:t>
       </w:r>
     </w:p>
     <w:p>
       <w:r>
-        <w:t>Code Screenshot:</w:t>
+        <w:rPr>
+          <w:b/>
+        </w:rPr>
+        <w:t>Output Screenshot:</w:t>
       </w:r>
     </w:p>
     <w:p>
       <w:r>
         <w:drawing>
           <wp:inline xmlns:a="http://schemas.openxmlformats.org/drawingml/2006/main" xmlns:pic="http://schemas.openxmlformats.org/drawingml/2006/picture">
-            <wp:extent cx="5486400" cy="2006455"/>
+            <wp:extent cx="5669280" cy="1318108"/>
             <wp:docPr id="11" name="Picture 11"/>
             <wp:cNvGraphicFramePr>
               <a:graphicFrameLocks noChangeAspect="1"/>
@@ -562,7 +886,7 @@
               <a:graphicData uri="http://schemas.openxmlformats.org/drawingml/2006/picture">
                 <pic:pic>
                   <pic:nvPicPr>
-                    <pic:cNvPr id="0" name="prog_1_code.png"/>
+                    <pic:cNvPr id="0" name="win_prog_6.png"/>
                     <pic:cNvPicPr/>
                   </pic:nvPicPr>
                   <pic:blipFill>
@@ -574,7 +898,7 @@
                   <pic:spPr>
                     <a:xfrm>
                       <a:off x="0" y="0"/>
-                      <a:ext cx="5486400" cy="2006455"/>
+                      <a:ext cx="5669280" cy="1318108"/>
                     </a:xfrm>
                     <a:prstGeom prst="rect"/>
                   </pic:spPr>
@@ -585,8 +909,70 @@
         </w:drawing>
       </w:r>
     </w:p>
+    <w:p/>
+    <w:p>
+      <w:pPr>
+        <w:pStyle w:val="Heading2"/>
+      </w:pPr>
+      <w:r>
+        <w:rPr>
+          <w:rFonts w:ascii="Calibri" w:hAnsi="Calibri"/>
+          <w:color w:val="006699"/>
+        </w:rPr>
+        <w:t>Program 7: Child Executes Another Program (exec())</w:t>
+      </w:r>
+    </w:p>
     <w:p>
       <w:r>
+        <w:rPr>
+          <w:b/>
+        </w:rPr>
+        <w:t>Source Code:</w:t>
+        <w:br/>
+      </w:r>
+      <w:r>
+        <w:rPr>
+          <w:rFonts w:ascii="Consolas" w:hAnsi="Consolas"/>
+          <w:sz w:val="19"/>
+        </w:rPr>
+        <w:t>#include &lt;stdio.h&gt;</w:t>
+        <w:br/>
+        <w:t>#include &lt;unistd.h&gt;</w:t>
+        <w:br/>
+        <w:t>int main()</w:t>
+        <w:br/>
+        <w:t>{</w:t>
+        <w:br/>
+        <w:t xml:space="preserve">    pid_t pid = fork();</w:t>
+        <w:br/>
+        <w:t xml:space="preserve">    if(pid == 0)</w:t>
+        <w:br/>
+        <w:t xml:space="preserve">    {</w:t>
+        <w:br/>
+        <w:t xml:space="preserve">        printf("Child executing ls...\n");</w:t>
+        <w:br/>
+        <w:t xml:space="preserve">        execl("/bin/ls","ls","-l",NULL);</w:t>
+        <w:br/>
+        <w:t xml:space="preserve">    }</w:t>
+        <w:br/>
+        <w:t xml:space="preserve">    else</w:t>
+        <w:br/>
+        <w:t xml:space="preserve">    {</w:t>
+        <w:br/>
+        <w:t xml:space="preserve">        printf("Parent Waiting...\n");</w:t>
+        <w:br/>
+        <w:t xml:space="preserve">    }</w:t>
+        <w:br/>
+        <w:t xml:space="preserve">    return 0;</w:t>
+        <w:br/>
+        <w:t>}</w:t>
+      </w:r>
+    </w:p>
+    <w:p>
+      <w:r>
+        <w:rPr>
+          <w:b/>
+        </w:rPr>
         <w:t>Output Screenshot:</w:t>
       </w:r>
     </w:p>
@@ -594,7 +980,7 @@
       <w:r>
         <w:drawing>
           <wp:inline xmlns:a="http://schemas.openxmlformats.org/drawingml/2006/main" xmlns:pic="http://schemas.openxmlformats.org/drawingml/2006/picture">
-            <wp:extent cx="5486400" cy="799447"/>
+            <wp:extent cx="5669280" cy="1459840"/>
             <wp:docPr id="12" name="Picture 12"/>
             <wp:cNvGraphicFramePr>
               <a:graphicFrameLocks noChangeAspect="1"/>
@@ -603,7 +989,7 @@
               <a:graphicData uri="http://schemas.openxmlformats.org/drawingml/2006/picture">
                 <pic:pic>
                   <pic:nvPicPr>
-                    <pic:cNvPr id="0" name="prog_1_output.png"/>
+                    <pic:cNvPr id="0" name="win_prog_7.png"/>
                     <pic:cNvPicPr/>
                   </pic:nvPicPr>
                   <pic:blipFill>
@@ -615,7 +1001,7 @@
                   <pic:spPr>
                     <a:xfrm>
                       <a:off x="0" y="0"/>
-                      <a:ext cx="5486400" cy="799447"/>
+                      <a:ext cx="5669280" cy="1459840"/>
                     </a:xfrm>
                     <a:prstGeom prst="rect"/>
                   </pic:spPr>
@@ -626,29 +1012,66 @@
         </w:drawing>
       </w:r>
     </w:p>
+    <w:p/>
     <w:p>
       <w:pPr>
-        <w:pStyle w:val="Heading3"/>
+        <w:pStyle w:val="Heading2"/>
       </w:pPr>
       <w:r>
-        <w:t>Program 2: fork() Creates a Child Process</w:t>
+        <w:rPr>
+          <w:rFonts w:ascii="Calibri" w:hAnsi="Calibri"/>
+          <w:color w:val="006699"/>
+        </w:rPr>
+        <w:t>Program 8: fork() Inside a Loop</w:t>
       </w:r>
     </w:p>
     <w:p>
       <w:r>
-        <w:t>Explanation: Demonstrates how fork() duplicates a process into parent and child.</w:t>
+        <w:rPr>
+          <w:b/>
+        </w:rPr>
+        <w:t>Source Code:</w:t>
+        <w:br/>
+      </w:r>
+      <w:r>
+        <w:rPr>
+          <w:rFonts w:ascii="Consolas" w:hAnsi="Consolas"/>
+          <w:sz w:val="19"/>
+        </w:rPr>
+        <w:t>#include &lt;stdio.h&gt;</w:t>
+        <w:br/>
+        <w:t>#include &lt;unistd.h&gt;</w:t>
+        <w:br/>
+        <w:t>int main()</w:t>
+        <w:br/>
+        <w:t>{</w:t>
+        <w:br/>
+        <w:t xml:space="preserve">    int i;</w:t>
+        <w:br/>
+        <w:t xml:space="preserve">    for(i=0;i&lt;3;i++)</w:t>
+        <w:br/>
+        <w:t xml:space="preserve">        fork();</w:t>
+        <w:br/>
+        <w:t xml:space="preserve">    printf("PID = %d\n",getpid());</w:t>
+        <w:br/>
+        <w:t xml:space="preserve">    return 0;</w:t>
+        <w:br/>
+        <w:t>}</w:t>
       </w:r>
     </w:p>
     <w:p>
       <w:r>
-        <w:t>Code Screenshot:</w:t>
+        <w:rPr>
+          <w:b/>
+        </w:rPr>
+        <w:t>Output Screenshot:</w:t>
       </w:r>
     </w:p>
     <w:p>
       <w:r>
         <w:drawing>
           <wp:inline xmlns:a="http://schemas.openxmlformats.org/drawingml/2006/main" xmlns:pic="http://schemas.openxmlformats.org/drawingml/2006/picture">
-            <wp:extent cx="5486400" cy="2178885"/>
+            <wp:extent cx="5669280" cy="1885036"/>
             <wp:docPr id="13" name="Picture 13"/>
             <wp:cNvGraphicFramePr>
               <a:graphicFrameLocks noChangeAspect="1"/>
@@ -657,7 +1080,7 @@
               <a:graphicData uri="http://schemas.openxmlformats.org/drawingml/2006/picture">
                 <pic:pic>
                   <pic:nvPicPr>
-                    <pic:cNvPr id="0" name="prog_2_code.png"/>
+                    <pic:cNvPr id="0" name="win_prog_8.png"/>
                     <pic:cNvPicPr/>
                   </pic:nvPicPr>
                   <pic:blipFill>
@@ -669,7 +1092,7 @@
                   <pic:spPr>
                     <a:xfrm>
                       <a:off x="0" y="0"/>
-                      <a:ext cx="5486400" cy="2178885"/>
+                      <a:ext cx="5669280" cy="1885036"/>
                     </a:xfrm>
                     <a:prstGeom prst="rect"/>
                   </pic:spPr>
@@ -680,8 +1103,109 @@
         </w:drawing>
       </w:r>
     </w:p>
+    <w:p/>
+    <w:p>
+      <w:pPr>
+        <w:pStyle w:val="Heading2"/>
+      </w:pPr>
+      <w:r>
+        <w:rPr>
+          <w:rFonts w:ascii="Calibri" w:hAnsi="Calibri"/>
+          <w:color w:val="006699"/>
+        </w:rPr>
+        <w:t>Program 9: Interactive Command Execution using fork(), exec(), and wait()</w:t>
+      </w:r>
+    </w:p>
     <w:p>
       <w:r>
+        <w:rPr>
+          <w:b/>
+        </w:rPr>
+        <w:t>Source Code:</w:t>
+        <w:br/>
+      </w:r>
+      <w:r>
+        <w:rPr>
+          <w:rFonts w:ascii="Consolas" w:hAnsi="Consolas"/>
+          <w:sz w:val="19"/>
+        </w:rPr>
+        <w:t>#include &lt;stdio.h&gt;</w:t>
+        <w:br/>
+        <w:t>#include &lt;stdlib.h&gt;</w:t>
+        <w:br/>
+        <w:t>#include &lt;unistd.h&gt;</w:t>
+        <w:br/>
+        <w:t>#include &lt;sys/wait.h&gt;</w:t>
+        <w:br/>
+        <w:br/>
+        <w:t>int main()</w:t>
+        <w:br/>
+        <w:t>{</w:t>
+        <w:br/>
+        <w:t xml:space="preserve">    char cmd[50];</w:t>
+        <w:br/>
+        <w:t xml:space="preserve">    printf("Enter Linux Command: ");</w:t>
+        <w:br/>
+        <w:t xml:space="preserve">    scanf("%s", cmd);</w:t>
+        <w:br/>
+        <w:br/>
+        <w:t xml:space="preserve">    pid_t pid = fork();</w:t>
+        <w:br/>
+        <w:br/>
+        <w:t xml:space="preserve">    if(pid &lt; 0)</w:t>
+        <w:br/>
+        <w:t xml:space="preserve">    {</w:t>
+        <w:br/>
+        <w:t xml:space="preserve">        printf("Fork Failed\n");</w:t>
+        <w:br/>
+        <w:t xml:space="preserve">        return 1;</w:t>
+        <w:br/>
+        <w:t xml:space="preserve">    }</w:t>
+        <w:br/>
+        <w:t xml:space="preserve">    else if(pid == 0)</w:t>
+        <w:br/>
+        <w:t xml:space="preserve">    {</w:t>
+        <w:br/>
+        <w:t xml:space="preserve">        printf("\nChild Process\n");</w:t>
+        <w:br/>
+        <w:t xml:space="preserve">        printf("Child PID : %d\n", getpid());</w:t>
+        <w:br/>
+        <w:t xml:space="preserve">        printf("Parent PID: %d\n", getppid());</w:t>
+        <w:br/>
+        <w:t xml:space="preserve">        execlp(cmd, cmd, NULL);</w:t>
+        <w:br/>
+        <w:t xml:space="preserve">        perror("Command Execution Failed");</w:t>
+        <w:br/>
+        <w:t xml:space="preserve">        exit(1);</w:t>
+        <w:br/>
+        <w:t xml:space="preserve">    }</w:t>
+        <w:br/>
+        <w:t xml:space="preserve">    else</w:t>
+        <w:br/>
+        <w:t xml:space="preserve">    {</w:t>
+        <w:br/>
+        <w:t xml:space="preserve">        printf("\nParent Process\n");</w:t>
+        <w:br/>
+        <w:t xml:space="preserve">        printf("Parent PID : %d\n", getpid());</w:t>
+        <w:br/>
+        <w:t xml:space="preserve">        printf("Child PID  : %d\n", pid);</w:t>
+        <w:br/>
+        <w:t xml:space="preserve">        wait(NULL);</w:t>
+        <w:br/>
+        <w:t xml:space="preserve">        printf("\nChild Process Completed\n");</w:t>
+        <w:br/>
+        <w:t xml:space="preserve">    }</w:t>
+        <w:br/>
+        <w:t xml:space="preserve">    return 0;</w:t>
+        <w:br/>
+        <w:t>}</w:t>
+      </w:r>
+    </w:p>
+    <w:p>
+      <w:r>
+        <w:rPr>
+          <w:b/>
+        </w:rPr>
         <w:t>Output Screenshot:</w:t>
       </w:r>
     </w:p>
@@ -689,7 +1213,7 @@
       <w:r>
         <w:drawing>
           <wp:inline xmlns:a="http://schemas.openxmlformats.org/drawingml/2006/main" xmlns:pic="http://schemas.openxmlformats.org/drawingml/2006/picture">
-            <wp:extent cx="5486400" cy="971877"/>
+            <wp:extent cx="5669280" cy="2451964"/>
             <wp:docPr id="14" name="Picture 14"/>
             <wp:cNvGraphicFramePr>
               <a:graphicFrameLocks noChangeAspect="1"/>
@@ -698,7 +1222,7 @@
               <a:graphicData uri="http://schemas.openxmlformats.org/drawingml/2006/picture">
                 <pic:pic>
                   <pic:nvPicPr>
-                    <pic:cNvPr id="0" name="prog_2_output.png"/>
+                    <pic:cNvPr id="0" name="win_prog_9.png"/>
                     <pic:cNvPicPr/>
                   </pic:nvPicPr>
                   <pic:blipFill>
@@ -710,7 +1234,7 @@
                   <pic:spPr>
                     <a:xfrm>
                       <a:off x="0" y="0"/>
-                      <a:ext cx="5486400" cy="971877"/>
+                      <a:ext cx="5669280" cy="2451964"/>
                     </a:xfrm>
                     <a:prstGeom prst="rect"/>
                   </pic:spPr>
@@ -721,674 +1245,10 @@
         </w:drawing>
       </w:r>
     </w:p>
-    <w:p>
-      <w:pPr>
-        <w:pStyle w:val="Heading3"/>
-      </w:pPr>
-      <w:r>
-        <w:t>Program 3: Differentiating Parent and Child Process</w:t>
-      </w:r>
-    </w:p>
-    <w:p>
-      <w:r>
-        <w:t>Explanation: fork() returns 0 to the child and child PID to parent.</w:t>
-      </w:r>
-    </w:p>
-    <w:p>
-      <w:r>
-        <w:t>Code Screenshot:</w:t>
-      </w:r>
-    </w:p>
-    <w:p>
-      <w:r>
-        <w:drawing>
-          <wp:inline xmlns:a="http://schemas.openxmlformats.org/drawingml/2006/main" xmlns:pic="http://schemas.openxmlformats.org/drawingml/2006/picture">
-            <wp:extent cx="5486400" cy="2696174"/>
-            <wp:docPr id="15" name="Picture 15"/>
-            <wp:cNvGraphicFramePr>
-              <a:graphicFrameLocks noChangeAspect="1"/>
-            </wp:cNvGraphicFramePr>
-            <a:graphic>
-              <a:graphicData uri="http://schemas.openxmlformats.org/drawingml/2006/picture">
-                <pic:pic>
-                  <pic:nvPicPr>
-                    <pic:cNvPr id="0" name="prog_3_code.png"/>
-                    <pic:cNvPicPr/>
-                  </pic:nvPicPr>
-                  <pic:blipFill>
-                    <a:blip r:embed="rId23"/>
-                    <a:stretch>
-                      <a:fillRect/>
-                    </a:stretch>
-                  </pic:blipFill>
-                  <pic:spPr>
-                    <a:xfrm>
-                      <a:off x="0" y="0"/>
-                      <a:ext cx="5486400" cy="2696174"/>
-                    </a:xfrm>
-                    <a:prstGeom prst="rect"/>
-                  </pic:spPr>
-                </pic:pic>
-              </a:graphicData>
-            </a:graphic>
-          </wp:inline>
-        </w:drawing>
-      </w:r>
-    </w:p>
-    <w:p>
-      <w:r>
-        <w:t>Output Screenshot:</w:t>
-      </w:r>
-    </w:p>
-    <w:p>
-      <w:r>
-        <w:drawing>
-          <wp:inline xmlns:a="http://schemas.openxmlformats.org/drawingml/2006/main" xmlns:pic="http://schemas.openxmlformats.org/drawingml/2006/picture">
-            <wp:extent cx="5486400" cy="971877"/>
-            <wp:docPr id="16" name="Picture 16"/>
-            <wp:cNvGraphicFramePr>
-              <a:graphicFrameLocks noChangeAspect="1"/>
-            </wp:cNvGraphicFramePr>
-            <a:graphic>
-              <a:graphicData uri="http://schemas.openxmlformats.org/drawingml/2006/picture">
-                <pic:pic>
-                  <pic:nvPicPr>
-                    <pic:cNvPr id="0" name="prog_3_output.png"/>
-                    <pic:cNvPicPr/>
-                  </pic:nvPicPr>
-                  <pic:blipFill>
-                    <a:blip r:embed="rId24"/>
-                    <a:stretch>
-                      <a:fillRect/>
-                    </a:stretch>
-                  </pic:blipFill>
-                  <pic:spPr>
-                    <a:xfrm>
-                      <a:off x="0" y="0"/>
-                      <a:ext cx="5486400" cy="971877"/>
-                    </a:xfrm>
-                    <a:prstGeom prst="rect"/>
-                  </pic:spPr>
-                </pic:pic>
-              </a:graphicData>
-            </a:graphic>
-          </wp:inline>
-        </w:drawing>
-      </w:r>
-    </w:p>
-    <w:p>
-      <w:pPr>
-        <w:pStyle w:val="Heading3"/>
-      </w:pPr>
-      <w:r>
-        <w:t>Program 4: Displaying Both Parent and Child PIDs</w:t>
-      </w:r>
-    </w:p>
-    <w:p>
-      <w:r>
-        <w:t>Explanation: Inspects getpid() and getppid() relationship.</w:t>
-      </w:r>
-    </w:p>
-    <w:p>
-      <w:r>
-        <w:t>Code Screenshot:</w:t>
-      </w:r>
-    </w:p>
-    <w:p>
-      <w:r>
-        <w:drawing>
-          <wp:inline xmlns:a="http://schemas.openxmlformats.org/drawingml/2006/main" xmlns:pic="http://schemas.openxmlformats.org/drawingml/2006/picture">
-            <wp:extent cx="5486400" cy="3213463"/>
-            <wp:docPr id="17" name="Picture 17"/>
-            <wp:cNvGraphicFramePr>
-              <a:graphicFrameLocks noChangeAspect="1"/>
-            </wp:cNvGraphicFramePr>
-            <a:graphic>
-              <a:graphicData uri="http://schemas.openxmlformats.org/drawingml/2006/picture">
-                <pic:pic>
-                  <pic:nvPicPr>
-                    <pic:cNvPr id="0" name="prog_4_code.png"/>
-                    <pic:cNvPicPr/>
-                  </pic:nvPicPr>
-                  <pic:blipFill>
-                    <a:blip r:embed="rId25"/>
-                    <a:stretch>
-                      <a:fillRect/>
-                    </a:stretch>
-                  </pic:blipFill>
-                  <pic:spPr>
-                    <a:xfrm>
-                      <a:off x="0" y="0"/>
-                      <a:ext cx="5486400" cy="3213463"/>
-                    </a:xfrm>
-                    <a:prstGeom prst="rect"/>
-                  </pic:spPr>
-                </pic:pic>
-              </a:graphicData>
-            </a:graphic>
-          </wp:inline>
-        </w:drawing>
-      </w:r>
-    </w:p>
-    <w:p>
-      <w:r>
-        <w:t>Output Screenshot:</w:t>
-      </w:r>
-    </w:p>
-    <w:p>
-      <w:r>
-        <w:drawing>
-          <wp:inline xmlns:a="http://schemas.openxmlformats.org/drawingml/2006/main" xmlns:pic="http://schemas.openxmlformats.org/drawingml/2006/picture">
-            <wp:extent cx="5486400" cy="1316736"/>
-            <wp:docPr id="18" name="Picture 18"/>
-            <wp:cNvGraphicFramePr>
-              <a:graphicFrameLocks noChangeAspect="1"/>
-            </wp:cNvGraphicFramePr>
-            <a:graphic>
-              <a:graphicData uri="http://schemas.openxmlformats.org/drawingml/2006/picture">
-                <pic:pic>
-                  <pic:nvPicPr>
-                    <pic:cNvPr id="0" name="prog_4_output.png"/>
-                    <pic:cNvPicPr/>
-                  </pic:nvPicPr>
-                  <pic:blipFill>
-                    <a:blip r:embed="rId26"/>
-                    <a:stretch>
-                      <a:fillRect/>
-                    </a:stretch>
-                  </pic:blipFill>
-                  <pic:spPr>
-                    <a:xfrm>
-                      <a:off x="0" y="0"/>
-                      <a:ext cx="5486400" cy="1316736"/>
-                    </a:xfrm>
-                    <a:prstGeom prst="rect"/>
-                  </pic:spPr>
-                </pic:pic>
-              </a:graphicData>
-            </a:graphic>
-          </wp:inline>
-        </w:drawing>
-      </w:r>
-    </w:p>
-    <w:p>
-      <w:pPr>
-        <w:pStyle w:val="Heading3"/>
-      </w:pPr>
-      <w:r>
-        <w:t>Program 5: Parent Synchronization using wait()</w:t>
-      </w:r>
-    </w:p>
-    <w:p>
-      <w:r>
-        <w:t>Explanation: Parent process blocks until child process terminates.</w:t>
-      </w:r>
-    </w:p>
-    <w:p>
-      <w:r>
-        <w:t>Code Screenshot:</w:t>
-      </w:r>
-    </w:p>
-    <w:p>
-      <w:r>
-        <w:drawing>
-          <wp:inline xmlns:a="http://schemas.openxmlformats.org/drawingml/2006/main" xmlns:pic="http://schemas.openxmlformats.org/drawingml/2006/picture">
-            <wp:extent cx="5486400" cy="3213463"/>
-            <wp:docPr id="19" name="Picture 19"/>
-            <wp:cNvGraphicFramePr>
-              <a:graphicFrameLocks noChangeAspect="1"/>
-            </wp:cNvGraphicFramePr>
-            <a:graphic>
-              <a:graphicData uri="http://schemas.openxmlformats.org/drawingml/2006/picture">
-                <pic:pic>
-                  <pic:nvPicPr>
-                    <pic:cNvPr id="0" name="prog_5_code.png"/>
-                    <pic:cNvPicPr/>
-                  </pic:nvPicPr>
-                  <pic:blipFill>
-                    <a:blip r:embed="rId27"/>
-                    <a:stretch>
-                      <a:fillRect/>
-                    </a:stretch>
-                  </pic:blipFill>
-                  <pic:spPr>
-                    <a:xfrm>
-                      <a:off x="0" y="0"/>
-                      <a:ext cx="5486400" cy="3213463"/>
-                    </a:xfrm>
-                    <a:prstGeom prst="rect"/>
-                  </pic:spPr>
-                </pic:pic>
-              </a:graphicData>
-            </a:graphic>
-          </wp:inline>
-        </w:drawing>
-      </w:r>
-    </w:p>
-    <w:p>
-      <w:r>
-        <w:t>Output Screenshot:</w:t>
-      </w:r>
-    </w:p>
-    <w:p>
-      <w:r>
-        <w:drawing>
-          <wp:inline xmlns:a="http://schemas.openxmlformats.org/drawingml/2006/main" xmlns:pic="http://schemas.openxmlformats.org/drawingml/2006/picture">
-            <wp:extent cx="5486400" cy="971877"/>
-            <wp:docPr id="20" name="Picture 20"/>
-            <wp:cNvGraphicFramePr>
-              <a:graphicFrameLocks noChangeAspect="1"/>
-            </wp:cNvGraphicFramePr>
-            <a:graphic>
-              <a:graphicData uri="http://schemas.openxmlformats.org/drawingml/2006/picture">
-                <pic:pic>
-                  <pic:nvPicPr>
-                    <pic:cNvPr id="0" name="prog_5_output.png"/>
-                    <pic:cNvPicPr/>
-                  </pic:nvPicPr>
-                  <pic:blipFill>
-                    <a:blip r:embed="rId28"/>
-                    <a:stretch>
-                      <a:fillRect/>
-                    </a:stretch>
-                  </pic:blipFill>
-                  <pic:spPr>
-                    <a:xfrm>
-                      <a:off x="0" y="0"/>
-                      <a:ext cx="5486400" cy="971877"/>
-                    </a:xfrm>
-                    <a:prstGeom prst="rect"/>
-                  </pic:spPr>
-                </pic:pic>
-              </a:graphicData>
-            </a:graphic>
-          </wp:inline>
-        </w:drawing>
-      </w:r>
-    </w:p>
-    <w:p>
-      <w:pPr>
-        <w:pStyle w:val="Heading3"/>
-      </w:pPr>
-      <w:r>
-        <w:t>Program 6: Multiple fork() Calls</w:t>
-      </w:r>
-    </w:p>
-    <w:p>
-      <w:r>
-        <w:t>Explanation: Calling fork() twice creates 2^2 = 4 total processes.</w:t>
-      </w:r>
-    </w:p>
-    <w:p>
-      <w:r>
-        <w:t>Code Screenshot:</w:t>
-      </w:r>
-    </w:p>
-    <w:p>
-      <w:r>
-        <w:drawing>
-          <wp:inline xmlns:a="http://schemas.openxmlformats.org/drawingml/2006/main" xmlns:pic="http://schemas.openxmlformats.org/drawingml/2006/picture">
-            <wp:extent cx="5486400" cy="2351314"/>
-            <wp:docPr id="21" name="Picture 21"/>
-            <wp:cNvGraphicFramePr>
-              <a:graphicFrameLocks noChangeAspect="1"/>
-            </wp:cNvGraphicFramePr>
-            <a:graphic>
-              <a:graphicData uri="http://schemas.openxmlformats.org/drawingml/2006/picture">
-                <pic:pic>
-                  <pic:nvPicPr>
-                    <pic:cNvPr id="0" name="prog_6_code.png"/>
-                    <pic:cNvPicPr/>
-                  </pic:nvPicPr>
-                  <pic:blipFill>
-                    <a:blip r:embed="rId29"/>
-                    <a:stretch>
-                      <a:fillRect/>
-                    </a:stretch>
-                  </pic:blipFill>
-                  <pic:spPr>
-                    <a:xfrm>
-                      <a:off x="0" y="0"/>
-                      <a:ext cx="5486400" cy="2351314"/>
-                    </a:xfrm>
-                    <a:prstGeom prst="rect"/>
-                  </pic:spPr>
-                </pic:pic>
-              </a:graphicData>
-            </a:graphic>
-          </wp:inline>
-        </w:drawing>
-      </w:r>
-    </w:p>
-    <w:p>
-      <w:r>
-        <w:t>Output Screenshot:</w:t>
-      </w:r>
-    </w:p>
-    <w:p>
-      <w:r>
-        <w:drawing>
-          <wp:inline xmlns:a="http://schemas.openxmlformats.org/drawingml/2006/main" xmlns:pic="http://schemas.openxmlformats.org/drawingml/2006/picture">
-            <wp:extent cx="5486400" cy="1316736"/>
-            <wp:docPr id="22" name="Picture 22"/>
-            <wp:cNvGraphicFramePr>
-              <a:graphicFrameLocks noChangeAspect="1"/>
-            </wp:cNvGraphicFramePr>
-            <a:graphic>
-              <a:graphicData uri="http://schemas.openxmlformats.org/drawingml/2006/picture">
-                <pic:pic>
-                  <pic:nvPicPr>
-                    <pic:cNvPr id="0" name="prog_6_output.png"/>
-                    <pic:cNvPicPr/>
-                  </pic:nvPicPr>
-                  <pic:blipFill>
-                    <a:blip r:embed="rId30"/>
-                    <a:stretch>
-                      <a:fillRect/>
-                    </a:stretch>
-                  </pic:blipFill>
-                  <pic:spPr>
-                    <a:xfrm>
-                      <a:off x="0" y="0"/>
-                      <a:ext cx="5486400" cy="1316736"/>
-                    </a:xfrm>
-                    <a:prstGeom prst="rect"/>
-                  </pic:spPr>
-                </pic:pic>
-              </a:graphicData>
-            </a:graphic>
-          </wp:inline>
-        </w:drawing>
-      </w:r>
-    </w:p>
-    <w:p>
-      <w:pPr>
-        <w:pStyle w:val="Heading3"/>
-      </w:pPr>
-      <w:r>
-        <w:t>Program 7: Process Replacement using exec()</w:t>
-      </w:r>
-    </w:p>
-    <w:p>
-      <w:r>
-        <w:t>Explanation: execl() replaces child image with /bin/ls.</w:t>
-      </w:r>
-    </w:p>
-    <w:p>
-      <w:r>
-        <w:t>Code Screenshot:</w:t>
-      </w:r>
-    </w:p>
-    <w:p>
-      <w:r>
-        <w:drawing>
-          <wp:inline xmlns:a="http://schemas.openxmlformats.org/drawingml/2006/main" xmlns:pic="http://schemas.openxmlformats.org/drawingml/2006/picture">
-            <wp:extent cx="5486400" cy="3041033"/>
-            <wp:docPr id="23" name="Picture 23"/>
-            <wp:cNvGraphicFramePr>
-              <a:graphicFrameLocks noChangeAspect="1"/>
-            </wp:cNvGraphicFramePr>
-            <a:graphic>
-              <a:graphicData uri="http://schemas.openxmlformats.org/drawingml/2006/picture">
-                <pic:pic>
-                  <pic:nvPicPr>
-                    <pic:cNvPr id="0" name="prog_7_code.png"/>
-                    <pic:cNvPicPr/>
-                  </pic:nvPicPr>
-                  <pic:blipFill>
-                    <a:blip r:embed="rId31"/>
-                    <a:stretch>
-                      <a:fillRect/>
-                    </a:stretch>
-                  </pic:blipFill>
-                  <pic:spPr>
-                    <a:xfrm>
-                      <a:off x="0" y="0"/>
-                      <a:ext cx="5486400" cy="3041033"/>
-                    </a:xfrm>
-                    <a:prstGeom prst="rect"/>
-                  </pic:spPr>
-                </pic:pic>
-              </a:graphicData>
-            </a:graphic>
-          </wp:inline>
-        </w:drawing>
-      </w:r>
-    </w:p>
-    <w:p>
-      <w:r>
-        <w:t>Output Screenshot:</w:t>
-      </w:r>
-    </w:p>
-    <w:p>
-      <w:r>
-        <w:drawing>
-          <wp:inline xmlns:a="http://schemas.openxmlformats.org/drawingml/2006/main" xmlns:pic="http://schemas.openxmlformats.org/drawingml/2006/picture">
-            <wp:extent cx="5486400" cy="1489166"/>
-            <wp:docPr id="24" name="Picture 24"/>
-            <wp:cNvGraphicFramePr>
-              <a:graphicFrameLocks noChangeAspect="1"/>
-            </wp:cNvGraphicFramePr>
-            <a:graphic>
-              <a:graphicData uri="http://schemas.openxmlformats.org/drawingml/2006/picture">
-                <pic:pic>
-                  <pic:nvPicPr>
-                    <pic:cNvPr id="0" name="prog_7_output.png"/>
-                    <pic:cNvPicPr/>
-                  </pic:nvPicPr>
-                  <pic:blipFill>
-                    <a:blip r:embed="rId32"/>
-                    <a:stretch>
-                      <a:fillRect/>
-                    </a:stretch>
-                  </pic:blipFill>
-                  <pic:spPr>
-                    <a:xfrm>
-                      <a:off x="0" y="0"/>
-                      <a:ext cx="5486400" cy="1489166"/>
-                    </a:xfrm>
-                    <a:prstGeom prst="rect"/>
-                  </pic:spPr>
-                </pic:pic>
-              </a:graphicData>
-            </a:graphic>
-          </wp:inline>
-        </w:drawing>
-      </w:r>
-    </w:p>
-    <w:p>
-      <w:pPr>
-        <w:pStyle w:val="Heading3"/>
-      </w:pPr>
-      <w:r>
-        <w:t>Program 8: fork() inside a Loop</w:t>
-      </w:r>
-    </w:p>
-    <w:p>
-      <w:r>
-        <w:t>Explanation: Looping fork() 3 times generates 2^3 = 8 processes.</w:t>
-      </w:r>
-    </w:p>
-    <w:p>
-      <w:r>
-        <w:t>Code Screenshot:</w:t>
-      </w:r>
-    </w:p>
-    <w:p>
-      <w:r>
-        <w:drawing>
-          <wp:inline xmlns:a="http://schemas.openxmlformats.org/drawingml/2006/main" xmlns:pic="http://schemas.openxmlformats.org/drawingml/2006/picture">
-            <wp:extent cx="5486400" cy="2523744"/>
-            <wp:docPr id="25" name="Picture 25"/>
-            <wp:cNvGraphicFramePr>
-              <a:graphicFrameLocks noChangeAspect="1"/>
-            </wp:cNvGraphicFramePr>
-            <a:graphic>
-              <a:graphicData uri="http://schemas.openxmlformats.org/drawingml/2006/picture">
-                <pic:pic>
-                  <pic:nvPicPr>
-                    <pic:cNvPr id="0" name="prog_8_code.png"/>
-                    <pic:cNvPicPr/>
-                  </pic:nvPicPr>
-                  <pic:blipFill>
-                    <a:blip r:embed="rId33"/>
-                    <a:stretch>
-                      <a:fillRect/>
-                    </a:stretch>
-                  </pic:blipFill>
-                  <pic:spPr>
-                    <a:xfrm>
-                      <a:off x="0" y="0"/>
-                      <a:ext cx="5486400" cy="2523744"/>
-                    </a:xfrm>
-                    <a:prstGeom prst="rect"/>
-                  </pic:spPr>
-                </pic:pic>
-              </a:graphicData>
-            </a:graphic>
-          </wp:inline>
-        </w:drawing>
-      </w:r>
-    </w:p>
-    <w:p>
-      <w:r>
-        <w:t>Output Screenshot:</w:t>
-      </w:r>
-    </w:p>
-    <w:p>
-      <w:r>
-        <w:drawing>
-          <wp:inline xmlns:a="http://schemas.openxmlformats.org/drawingml/2006/main" xmlns:pic="http://schemas.openxmlformats.org/drawingml/2006/picture">
-            <wp:extent cx="5486400" cy="2006455"/>
-            <wp:docPr id="26" name="Picture 26"/>
-            <wp:cNvGraphicFramePr>
-              <a:graphicFrameLocks noChangeAspect="1"/>
-            </wp:cNvGraphicFramePr>
-            <a:graphic>
-              <a:graphicData uri="http://schemas.openxmlformats.org/drawingml/2006/picture">
-                <pic:pic>
-                  <pic:nvPicPr>
-                    <pic:cNvPr id="0" name="prog_8_output.png"/>
-                    <pic:cNvPicPr/>
-                  </pic:nvPicPr>
-                  <pic:blipFill>
-                    <a:blip r:embed="rId34"/>
-                    <a:stretch>
-                      <a:fillRect/>
-                    </a:stretch>
-                  </pic:blipFill>
-                  <pic:spPr>
-                    <a:xfrm>
-                      <a:off x="0" y="0"/>
-                      <a:ext cx="5486400" cy="2006455"/>
-                    </a:xfrm>
-                    <a:prstGeom prst="rect"/>
-                  </pic:spPr>
-                </pic:pic>
-              </a:graphicData>
-            </a:graphic>
-          </wp:inline>
-        </w:drawing>
-      </w:r>
-    </w:p>
-    <w:p>
-      <w:pPr>
-        <w:pStyle w:val="Heading3"/>
-      </w:pPr>
-      <w:r>
-        <w:t>Program 9: Interactive Command Execution Shell</w:t>
-      </w:r>
-    </w:p>
-    <w:p>
-      <w:r>
-        <w:t>Explanation: Combines fork(), execlp(), and wait() to execute arbitrary commands.</w:t>
-      </w:r>
-    </w:p>
-    <w:p>
-      <w:r>
-        <w:t>Code Screenshot:</w:t>
-      </w:r>
-    </w:p>
-    <w:p>
-      <w:r>
-        <w:drawing>
-          <wp:inline xmlns:a="http://schemas.openxmlformats.org/drawingml/2006/main" xmlns:pic="http://schemas.openxmlformats.org/drawingml/2006/picture">
-            <wp:extent cx="5486400" cy="6127262"/>
-            <wp:docPr id="27" name="Picture 27"/>
-            <wp:cNvGraphicFramePr>
-              <a:graphicFrameLocks noChangeAspect="1"/>
-            </wp:cNvGraphicFramePr>
-            <a:graphic>
-              <a:graphicData uri="http://schemas.openxmlformats.org/drawingml/2006/picture">
-                <pic:pic>
-                  <pic:nvPicPr>
-                    <pic:cNvPr id="0" name="prog_9_code.png"/>
-                    <pic:cNvPicPr/>
-                  </pic:nvPicPr>
-                  <pic:blipFill>
-                    <a:blip r:embed="rId35"/>
-                    <a:stretch>
-                      <a:fillRect/>
-                    </a:stretch>
-                  </pic:blipFill>
-                  <pic:spPr>
-                    <a:xfrm>
-                      <a:off x="0" y="0"/>
-                      <a:ext cx="5486400" cy="6127262"/>
-                    </a:xfrm>
-                    <a:prstGeom prst="rect"/>
-                  </pic:spPr>
-                </pic:pic>
-              </a:graphicData>
-            </a:graphic>
-          </wp:inline>
-        </w:drawing>
-      </w:r>
-    </w:p>
-    <w:p>
-      <w:r>
-        <w:t>Output Screenshot:</w:t>
-      </w:r>
-    </w:p>
-    <w:p>
-      <w:r>
-        <w:drawing>
-          <wp:inline xmlns:a="http://schemas.openxmlformats.org/drawingml/2006/main" xmlns:pic="http://schemas.openxmlformats.org/drawingml/2006/picture">
-            <wp:extent cx="5486400" cy="2696174"/>
-            <wp:docPr id="28" name="Picture 28"/>
-            <wp:cNvGraphicFramePr>
-              <a:graphicFrameLocks noChangeAspect="1"/>
-            </wp:cNvGraphicFramePr>
-            <a:graphic>
-              <a:graphicData uri="http://schemas.openxmlformats.org/drawingml/2006/picture">
-                <pic:pic>
-                  <pic:nvPicPr>
-                    <pic:cNvPr id="0" name="prog_9_output.png"/>
-                    <pic:cNvPicPr/>
-                  </pic:nvPicPr>
-                  <pic:blipFill>
-                    <a:blip r:embed="rId36"/>
-                    <a:stretch>
-                      <a:fillRect/>
-                    </a:stretch>
-                  </pic:blipFill>
-                  <pic:spPr>
-                    <a:xfrm>
-                      <a:off x="0" y="0"/>
-                      <a:ext cx="5486400" cy="2696174"/>
-                    </a:xfrm>
-                    <a:prstGeom prst="rect"/>
-                  </pic:spPr>
-                </pic:pic>
-              </a:graphicData>
-            </a:graphic>
-          </wp:inline>
-        </w:drawing>
-      </w:r>
-    </w:p>
+    <w:p/>
     <w:sectPr>
       <w:pgSz w:w="12240" w:h="15840"/>
-      <w:pgMar w:top="1440" w:right="1800" w:bottom="1440" w:left="1800" w:header="720" w:footer="720" w:gutter="0"/>
+      <w:pgMar w:top="1440" w:right="1440" w:bottom="1440" w:left="1440" w:header="720" w:footer="720" w:gutter="0"/>
       <w:cols w:space="720"/>
       <w:docGrid w:linePitch="360"/>
     </w:sectPr>

</xml_diff>